<commit_message>
Initial commit: Add data analysis notes and resources
</commit_message>
<xml_diff>
--- a/Excel/EXCEL.docx
+++ b/Excel/EXCEL.docx
@@ -70,6 +70,196 @@
           <w:lang w:val="en-GB"/>
         </w:rPr>
         <w:t>***************************************************************************</w:t>
+      </w:r>
+    </w:p>
+    <w:p>
+      <w:pPr>
+        <w:rPr>
+          <w:b/>
+          <w:sz w:val="28"/>
+          <w:szCs w:val="28"/>
+          <w:lang w:val="en-GB"/>
+        </w:rPr>
+      </w:pPr>
+      <w:proofErr w:type="gramStart"/>
+      <w:r>
+        <w:rPr>
+          <w:b/>
+          <w:sz w:val="28"/>
+          <w:szCs w:val="28"/>
+          <w:lang w:val="en-GB"/>
+        </w:rPr>
+        <w:t>Note :</w:t>
+      </w:r>
+      <w:proofErr w:type="gramEnd"/>
+      <w:r>
+        <w:rPr>
+          <w:b/>
+          <w:sz w:val="28"/>
+          <w:szCs w:val="28"/>
+          <w:lang w:val="en-GB"/>
+        </w:rPr>
+        <w:t>-</w:t>
+      </w:r>
+      <w:r>
+        <w:rPr>
+          <w:b/>
+          <w:sz w:val="28"/>
+          <w:szCs w:val="28"/>
+          <w:lang w:val="en-GB"/>
+        </w:rPr>
+        <w:t xml:space="preserve"> </w:t>
+      </w:r>
+    </w:p>
+    <w:p>
+      <w:pPr>
+        <w:pStyle w:val="ListParagraph"/>
+        <w:numPr>
+          <w:ilvl w:val="0"/>
+          <w:numId w:val="9"/>
+        </w:numPr>
+        <w:rPr>
+          <w:sz w:val="28"/>
+          <w:szCs w:val="28"/>
+          <w:lang w:val="en-GB"/>
+        </w:rPr>
+      </w:pPr>
+      <w:r>
+        <w:rPr>
+          <w:b/>
+          <w:sz w:val="28"/>
+          <w:szCs w:val="28"/>
+          <w:lang w:val="en-GB"/>
+        </w:rPr>
+        <w:t xml:space="preserve"> </w:t>
+      </w:r>
+      <w:r>
+        <w:rPr>
+          <w:sz w:val="28"/>
+          <w:szCs w:val="28"/>
+          <w:lang w:val="en-GB"/>
+        </w:rPr>
+        <w:t>To format entire dataset (mean set wi</w:t>
+      </w:r>
+      <w:r>
+        <w:rPr>
+          <w:sz w:val="28"/>
+          <w:szCs w:val="28"/>
+          <w:lang w:val="en-GB"/>
+        </w:rPr>
+        <w:t>d</w:t>
+      </w:r>
+      <w:r>
+        <w:rPr>
+          <w:sz w:val="28"/>
+          <w:szCs w:val="28"/>
+          <w:lang w:val="en-GB"/>
+        </w:rPr>
+        <w:t>th of each colum</w:t>
+      </w:r>
+      <w:r>
+        <w:rPr>
+          <w:sz w:val="28"/>
+          <w:szCs w:val="28"/>
+          <w:lang w:val="en-GB"/>
+        </w:rPr>
+        <w:t>n</w:t>
+      </w:r>
+      <w:r>
+        <w:rPr>
+          <w:sz w:val="28"/>
+          <w:szCs w:val="28"/>
+          <w:lang w:val="en-GB"/>
+        </w:rPr>
+        <w:t xml:space="preserve">s press </w:t>
+      </w:r>
+      <w:proofErr w:type="spellStart"/>
+      <w:r>
+        <w:rPr>
+          <w:b/>
+          <w:sz w:val="28"/>
+          <w:szCs w:val="28"/>
+          <w:lang w:val="en-GB"/>
+        </w:rPr>
+        <w:t>altHOI</w:t>
+      </w:r>
+      <w:proofErr w:type="spellEnd"/>
+      <w:r>
+        <w:rPr>
+          <w:sz w:val="28"/>
+          <w:szCs w:val="28"/>
+          <w:lang w:val="en-GB"/>
+        </w:rPr>
+        <w:t xml:space="preserve">) and </w:t>
+      </w:r>
+      <w:proofErr w:type="gramStart"/>
+      <w:r>
+        <w:rPr>
+          <w:sz w:val="28"/>
+          <w:szCs w:val="28"/>
+          <w:lang w:val="en-GB"/>
+        </w:rPr>
+        <w:t>( set</w:t>
+      </w:r>
+      <w:proofErr w:type="gramEnd"/>
+      <w:r>
+        <w:rPr>
+          <w:sz w:val="28"/>
+          <w:szCs w:val="28"/>
+          <w:lang w:val="en-GB"/>
+        </w:rPr>
+        <w:t xml:space="preserve"> height of rows press </w:t>
+      </w:r>
+      <w:proofErr w:type="spellStart"/>
+      <w:r>
+        <w:rPr>
+          <w:b/>
+          <w:sz w:val="28"/>
+          <w:szCs w:val="28"/>
+          <w:lang w:val="en-GB"/>
+        </w:rPr>
+        <w:t>altHOA</w:t>
+      </w:r>
+      <w:proofErr w:type="spellEnd"/>
+      <w:r>
+        <w:rPr>
+          <w:b/>
+          <w:sz w:val="28"/>
+          <w:szCs w:val="28"/>
+          <w:lang w:val="en-GB"/>
+        </w:rPr>
+        <w:t>).</w:t>
+      </w:r>
+    </w:p>
+    <w:p>
+      <w:pPr>
+        <w:pStyle w:val="ListParagraph"/>
+        <w:numPr>
+          <w:ilvl w:val="0"/>
+          <w:numId w:val="9"/>
+        </w:numPr>
+        <w:rPr>
+          <w:sz w:val="28"/>
+          <w:szCs w:val="28"/>
+          <w:lang w:val="en-GB"/>
+        </w:rPr>
+      </w:pPr>
+    </w:p>
+    <w:p>
+      <w:pPr>
+        <w:rPr>
+          <w:b/>
+          <w:sz w:val="24"/>
+          <w:lang w:val="en-GB"/>
+        </w:rPr>
+      </w:pPr>
+      <w:r>
+        <w:rPr>
+          <w:b/>
+          <w:sz w:val="24"/>
+          <w:lang w:val="en-GB"/>
+        </w:rPr>
+        <w:t>--------------------------------------------------------------------------------------------------------------------------</w:t>
       </w:r>
     </w:p>
     <w:p>
@@ -81,115 +271,29 @@
         </w:numPr>
         <w:rPr>
           <w:b/>
-          <w:sz w:val="28"/>
-          <w:szCs w:val="28"/>
-          <w:lang w:val="en-GB"/>
-        </w:rPr>
-      </w:pPr>
-      <w:r>
-        <w:rPr>
-          <w:b/>
-          <w:sz w:val="28"/>
-          <w:szCs w:val="28"/>
+          <w:sz w:val="32"/>
+          <w:szCs w:val="32"/>
+          <w:u w:val="single"/>
+          <w:lang w:val="en-GB"/>
+        </w:rPr>
+      </w:pPr>
+      <w:r>
+        <w:rPr>
+          <w:b/>
+          <w:sz w:val="32"/>
+          <w:szCs w:val="32"/>
+          <w:u w:val="single"/>
         </w:rPr>
         <w:t>Data Management &amp; Cleaning</w:t>
       </w:r>
       <w:r>
         <w:rPr>
           <w:b/>
-          <w:sz w:val="28"/>
-          <w:szCs w:val="28"/>
+          <w:sz w:val="32"/>
+          <w:szCs w:val="32"/>
+          <w:u w:val="single"/>
         </w:rPr>
         <w:t xml:space="preserve"> </w:t>
-      </w:r>
-    </w:p>
-    <w:p>
-      <w:pPr>
-        <w:pStyle w:val="ListParagraph"/>
-        <w:rPr>
-          <w:sz w:val="28"/>
-          <w:szCs w:val="28"/>
-          <w:lang w:val="en-GB"/>
-        </w:rPr>
-      </w:pPr>
-      <w:r>
-        <w:rPr>
-          <w:b/>
-          <w:sz w:val="28"/>
-          <w:szCs w:val="28"/>
-          <w:lang w:val="en-GB"/>
-        </w:rPr>
-        <w:t xml:space="preserve">Note :- </w:t>
-      </w:r>
-      <w:r>
-        <w:rPr>
-          <w:sz w:val="28"/>
-          <w:szCs w:val="28"/>
-          <w:lang w:val="en-GB"/>
-        </w:rPr>
-        <w:t xml:space="preserve">To format entire dataset (mean set with of each </w:t>
-      </w:r>
-      <w:proofErr w:type="spellStart"/>
-      <w:r>
-        <w:rPr>
-          <w:sz w:val="28"/>
-          <w:szCs w:val="28"/>
-          <w:lang w:val="en-GB"/>
-        </w:rPr>
-        <w:t>colums</w:t>
-      </w:r>
-      <w:proofErr w:type="spellEnd"/>
-      <w:r>
-        <w:rPr>
-          <w:sz w:val="28"/>
-          <w:szCs w:val="28"/>
-          <w:lang w:val="en-GB"/>
-        </w:rPr>
-        <w:t xml:space="preserve"> pres</w:t>
-      </w:r>
-      <w:r>
-        <w:rPr>
-          <w:sz w:val="28"/>
-          <w:szCs w:val="28"/>
-          <w:lang w:val="en-GB"/>
-        </w:rPr>
-        <w:t>s</w:t>
-      </w:r>
-      <w:r>
-        <w:rPr>
-          <w:sz w:val="28"/>
-          <w:szCs w:val="28"/>
-          <w:lang w:val="en-GB"/>
-        </w:rPr>
-        <w:t xml:space="preserve"> </w:t>
-      </w:r>
-      <w:proofErr w:type="spellStart"/>
-      <w:r>
-        <w:rPr>
-          <w:b/>
-          <w:sz w:val="28"/>
-          <w:szCs w:val="28"/>
-          <w:lang w:val="en-GB"/>
-        </w:rPr>
-        <w:t>altHOI</w:t>
-      </w:r>
-      <w:proofErr w:type="spellEnd"/>
-      <w:r>
-        <w:rPr>
-          <w:b/>
-          <w:sz w:val="28"/>
-          <w:szCs w:val="28"/>
-          <w:lang w:val="en-GB"/>
-        </w:rPr>
-        <w:t xml:space="preserve"> </w:t>
-      </w:r>
-      <w:r>
-        <w:rPr>
-          <w:sz w:val="28"/>
-          <w:szCs w:val="28"/>
-          <w:lang w:val="en-GB"/>
-        </w:rPr>
-        <w:t>.</w:t>
       </w:r>
     </w:p>
     <w:p>
@@ -839,6 +943,7 @@
           <w:szCs w:val="28"/>
           <w:lang w:val="en-GB"/>
         </w:rPr>
+        <w:lastRenderedPageBreak/>
         <w:t xml:space="preserve">This can be auto recommended by EXCEL or press </w:t>
       </w:r>
       <w:proofErr w:type="spellStart"/>
@@ -881,6 +986,348 @@
         <w:t>.</w:t>
       </w:r>
       <w:proofErr w:type="gramEnd"/>
+    </w:p>
+    <w:p>
+      <w:pPr>
+        <w:rPr>
+          <w:b/>
+          <w:sz w:val="28"/>
+          <w:szCs w:val="28"/>
+          <w:lang w:val="en-GB"/>
+        </w:rPr>
+      </w:pPr>
+      <w:r>
+        <w:rPr>
+          <w:b/>
+          <w:sz w:val="28"/>
+          <w:szCs w:val="28"/>
+          <w:lang w:val="en-GB"/>
+        </w:rPr>
+        <w:t xml:space="preserve">The Way Of Data </w:t>
+      </w:r>
+      <w:proofErr w:type="gramStart"/>
+      <w:r>
+        <w:rPr>
+          <w:b/>
+          <w:sz w:val="28"/>
+          <w:szCs w:val="28"/>
+          <w:lang w:val="en-GB"/>
+        </w:rPr>
+        <w:t>Cleaning :</w:t>
+      </w:r>
+      <w:proofErr w:type="gramEnd"/>
+      <w:r>
+        <w:rPr>
+          <w:b/>
+          <w:sz w:val="28"/>
+          <w:szCs w:val="28"/>
+          <w:lang w:val="en-GB"/>
+        </w:rPr>
+        <w:t xml:space="preserve">- </w:t>
+      </w:r>
+    </w:p>
+    <w:p>
+      <w:pPr>
+        <w:pStyle w:val="ListParagraph"/>
+        <w:numPr>
+          <w:ilvl w:val="0"/>
+          <w:numId w:val="8"/>
+        </w:numPr>
+        <w:rPr>
+          <w:sz w:val="28"/>
+          <w:szCs w:val="28"/>
+          <w:lang w:val="en-GB"/>
+        </w:rPr>
+      </w:pPr>
+      <w:r>
+        <w:rPr>
+          <w:sz w:val="28"/>
+          <w:szCs w:val="28"/>
+          <w:lang w:val="en-GB"/>
+        </w:rPr>
+        <w:t>(Note 1 Format entire dataset)</w:t>
+      </w:r>
+    </w:p>
+    <w:p>
+      <w:pPr>
+        <w:pStyle w:val="ListParagraph"/>
+        <w:numPr>
+          <w:ilvl w:val="0"/>
+          <w:numId w:val="8"/>
+        </w:numPr>
+        <w:rPr>
+          <w:sz w:val="28"/>
+          <w:szCs w:val="28"/>
+          <w:lang w:val="en-GB"/>
+        </w:rPr>
+      </w:pPr>
+      <w:r>
+        <w:rPr>
+          <w:sz w:val="28"/>
+          <w:szCs w:val="28"/>
+          <w:lang w:val="en-GB"/>
+        </w:rPr>
+        <w:t>Remove Duplicate Data (Mention Above)</w:t>
+      </w:r>
+    </w:p>
+    <w:p>
+      <w:pPr>
+        <w:pStyle w:val="ListParagraph"/>
+        <w:numPr>
+          <w:ilvl w:val="0"/>
+          <w:numId w:val="8"/>
+        </w:numPr>
+        <w:rPr>
+          <w:sz w:val="28"/>
+          <w:szCs w:val="28"/>
+          <w:lang w:val="en-GB"/>
+        </w:rPr>
+      </w:pPr>
+      <w:r>
+        <w:rPr>
+          <w:sz w:val="28"/>
+          <w:szCs w:val="28"/>
+          <w:lang w:val="en-GB"/>
+        </w:rPr>
+        <w:t>Format The Name By using “</w:t>
+      </w:r>
+      <w:r>
+        <w:rPr>
+          <w:sz w:val="28"/>
+          <w:szCs w:val="28"/>
+          <w:lang w:val="en-GB"/>
+        </w:rPr>
+        <w:t>Proper</w:t>
+      </w:r>
+      <w:r>
+        <w:rPr>
+          <w:sz w:val="28"/>
+          <w:szCs w:val="28"/>
+          <w:lang w:val="en-GB"/>
+        </w:rPr>
+        <w:t>” function O</w:t>
+      </w:r>
+      <w:r>
+        <w:rPr>
+          <w:sz w:val="28"/>
+          <w:szCs w:val="28"/>
+          <w:lang w:val="en-GB"/>
+        </w:rPr>
+        <w:t xml:space="preserve">r </w:t>
+      </w:r>
+      <w:r>
+        <w:rPr>
+          <w:sz w:val="28"/>
+          <w:szCs w:val="28"/>
+          <w:lang w:val="en-GB"/>
+        </w:rPr>
+        <w:t>(Upper or lower)</w:t>
+      </w:r>
+      <w:r>
+        <w:rPr>
+          <w:sz w:val="28"/>
+          <w:szCs w:val="28"/>
+          <w:lang w:val="en-GB"/>
+        </w:rPr>
+        <w:t xml:space="preserve"> and </w:t>
+      </w:r>
+      <w:r>
+        <w:rPr>
+          <w:sz w:val="28"/>
+          <w:szCs w:val="28"/>
+          <w:lang w:val="en-GB"/>
+        </w:rPr>
+        <w:t>“</w:t>
+      </w:r>
+      <w:bookmarkStart w:id="0" w:name="_GoBack"/>
+      <w:bookmarkEnd w:id="0"/>
+      <w:r>
+        <w:rPr>
+          <w:sz w:val="28"/>
+          <w:szCs w:val="28"/>
+          <w:lang w:val="en-GB"/>
+        </w:rPr>
+        <w:t>Trim</w:t>
+      </w:r>
+      <w:r>
+        <w:rPr>
+          <w:sz w:val="28"/>
+          <w:szCs w:val="28"/>
+          <w:lang w:val="en-GB"/>
+        </w:rPr>
+        <w:t>”</w:t>
+      </w:r>
+      <w:r>
+        <w:rPr>
+          <w:sz w:val="28"/>
+          <w:szCs w:val="28"/>
+          <w:lang w:val="en-GB"/>
+        </w:rPr>
+        <w:t xml:space="preserve"> function. In this keep original data as it is and create new column, get corrected values into new column.</w:t>
+      </w:r>
+    </w:p>
+    <w:p>
+      <w:pPr>
+        <w:pStyle w:val="ListParagraph"/>
+        <w:ind w:left="1080"/>
+        <w:rPr>
+          <w:sz w:val="28"/>
+          <w:szCs w:val="28"/>
+          <w:lang w:val="en-GB"/>
+        </w:rPr>
+      </w:pPr>
+      <w:r>
+        <w:rPr>
+          <w:sz w:val="28"/>
+          <w:szCs w:val="28"/>
+          <w:lang w:val="en-GB"/>
+        </w:rPr>
+        <w:t>Copy-by-value this column onto the original one. Then discard this new column.</w:t>
+      </w:r>
+    </w:p>
+    <w:p>
+      <w:pPr>
+        <w:pStyle w:val="ListParagraph"/>
+        <w:numPr>
+          <w:ilvl w:val="0"/>
+          <w:numId w:val="8"/>
+        </w:numPr>
+        <w:rPr>
+          <w:sz w:val="28"/>
+          <w:szCs w:val="28"/>
+          <w:lang w:val="en-GB"/>
+        </w:rPr>
+      </w:pPr>
+      <w:r>
+        <w:rPr>
+          <w:sz w:val="28"/>
+          <w:szCs w:val="28"/>
+          <w:lang w:val="en-GB"/>
+        </w:rPr>
+        <w:t xml:space="preserve">Fixing </w:t>
+      </w:r>
+      <w:proofErr w:type="gramStart"/>
+      <w:r>
+        <w:rPr>
+          <w:sz w:val="28"/>
+          <w:szCs w:val="28"/>
+          <w:lang w:val="en-GB"/>
+        </w:rPr>
+        <w:t>Error :</w:t>
+      </w:r>
+      <w:proofErr w:type="gramEnd"/>
+      <w:r>
+        <w:rPr>
+          <w:sz w:val="28"/>
+          <w:szCs w:val="28"/>
+          <w:lang w:val="en-GB"/>
+        </w:rPr>
+        <w:t xml:space="preserve">- </w:t>
+      </w:r>
+      <w:r>
+        <w:rPr>
+          <w:sz w:val="28"/>
+          <w:szCs w:val="28"/>
+          <w:lang w:val="en-GB"/>
+        </w:rPr>
+        <w:t xml:space="preserve">If Column Contains </w:t>
+      </w:r>
+      <w:r>
+        <w:rPr>
+          <w:sz w:val="28"/>
+          <w:szCs w:val="28"/>
+          <w:lang w:val="en-GB"/>
+        </w:rPr>
+        <w:t>unique 1-6 tuples then Check that , Is there any spelling mistake is happened then tuples get reduces.</w:t>
+      </w:r>
+    </w:p>
+    <w:p>
+      <w:pPr>
+        <w:pStyle w:val="ListParagraph"/>
+        <w:numPr>
+          <w:ilvl w:val="0"/>
+          <w:numId w:val="8"/>
+        </w:numPr>
+        <w:rPr>
+          <w:sz w:val="28"/>
+          <w:szCs w:val="28"/>
+          <w:lang w:val="en-GB"/>
+        </w:rPr>
+      </w:pPr>
+      <w:r>
+        <w:rPr>
+          <w:sz w:val="28"/>
+          <w:szCs w:val="28"/>
+          <w:lang w:val="en-GB"/>
+        </w:rPr>
+        <w:t>Convert all columns of number into number format or in currency.</w:t>
+      </w:r>
+    </w:p>
+    <w:p>
+      <w:pPr>
+        <w:pStyle w:val="ListParagraph"/>
+        <w:numPr>
+          <w:ilvl w:val="0"/>
+          <w:numId w:val="8"/>
+        </w:numPr>
+        <w:rPr>
+          <w:sz w:val="28"/>
+          <w:szCs w:val="28"/>
+          <w:lang w:val="en-GB"/>
+        </w:rPr>
+      </w:pPr>
+      <w:r>
+        <w:rPr>
+          <w:sz w:val="28"/>
+          <w:szCs w:val="28"/>
+          <w:lang w:val="en-GB"/>
+        </w:rPr>
+        <w:t>Convert all Dates into one format type.</w:t>
+      </w:r>
+    </w:p>
+    <w:p>
+      <w:pPr>
+        <w:pStyle w:val="ListParagraph"/>
+        <w:numPr>
+          <w:ilvl w:val="0"/>
+          <w:numId w:val="8"/>
+        </w:numPr>
+        <w:rPr>
+          <w:sz w:val="28"/>
+          <w:szCs w:val="28"/>
+          <w:lang w:val="en-GB"/>
+        </w:rPr>
+      </w:pPr>
+      <w:r>
+        <w:rPr>
+          <w:sz w:val="28"/>
+          <w:szCs w:val="28"/>
+          <w:lang w:val="en-GB"/>
+        </w:rPr>
+        <w:t>Delete unwanted columns from dataset.</w:t>
+      </w:r>
+    </w:p>
+    <w:p>
+      <w:pPr>
+        <w:pStyle w:val="ListParagraph"/>
+        <w:numPr>
+          <w:ilvl w:val="0"/>
+          <w:numId w:val="8"/>
+        </w:numPr>
+        <w:rPr>
+          <w:sz w:val="28"/>
+          <w:szCs w:val="28"/>
+          <w:lang w:val="en-GB"/>
+        </w:rPr>
+      </w:pPr>
+      <w:r>
+        <w:rPr>
+          <w:sz w:val="28"/>
+          <w:szCs w:val="28"/>
+          <w:lang w:val="en-GB"/>
+        </w:rPr>
+        <w:t>Hence, Your dataset is Ready ….</w:t>
+      </w:r>
     </w:p>
     <w:p>
       <w:pPr>
@@ -918,8 +1365,8 @@
       <w:r>
         <w:rPr>
           <w:b/>
-          <w:sz w:val="28"/>
-          <w:szCs w:val="28"/>
+          <w:sz w:val="32"/>
+          <w:szCs w:val="32"/>
           <w:lang w:val="en-GB"/>
         </w:rPr>
         <w:t xml:space="preserve">Formula </w:t>
@@ -928,8 +1375,8 @@
       <w:r>
         <w:rPr>
           <w:b/>
-          <w:sz w:val="28"/>
-          <w:szCs w:val="28"/>
+          <w:sz w:val="32"/>
+          <w:szCs w:val="32"/>
           <w:lang w:val="en-GB"/>
         </w:rPr>
         <w:t>Mastery</w:t>
@@ -1008,7 +1455,6 @@
           <w:szCs w:val="28"/>
           <w:lang w:val="en-GB"/>
         </w:rPr>
-        <w:lastRenderedPageBreak/>
         <w:t>S</w:t>
       </w:r>
       <w:r>
@@ -1891,6 +2337,7 @@
           <w:szCs w:val="28"/>
           <w:lang w:val="en-GB"/>
         </w:rPr>
+        <w:lastRenderedPageBreak/>
         <w:t>TEXT(</w:t>
       </w:r>
       <w:proofErr w:type="gramEnd"/>
@@ -2710,7 +3157,6 @@
           <w:szCs w:val="28"/>
           <w:lang w:val="en-GB"/>
         </w:rPr>
-        <w:lastRenderedPageBreak/>
         <w:t xml:space="preserve">Means -- </w:t>
       </w:r>
       <w:r>
@@ -2768,17 +3214,7 @@
           <w:szCs w:val="28"/>
           <w:lang w:val="en-GB"/>
         </w:rPr>
-        <w:t>To return string in Proper format which is “First latter is capital and others are small for each word”</w:t>
-      </w:r>
-      <w:bookmarkStart w:id="0" w:name="_GoBack"/>
-      <w:bookmarkEnd w:id="0"/>
-      <w:r>
-        <w:rPr>
-          <w:sz w:val="28"/>
-          <w:szCs w:val="28"/>
-          <w:lang w:val="en-GB"/>
-        </w:rPr>
-        <w:t xml:space="preserve">. </w:t>
+        <w:t xml:space="preserve">To return string in Proper format which is “First latter is capital and others are small for each word”. </w:t>
       </w:r>
       <w:proofErr w:type="gramStart"/>
       <w:r>
@@ -3138,6 +3574,7 @@
           <w:szCs w:val="28"/>
           <w:lang w:val="en-GB"/>
         </w:rPr>
+        <w:lastRenderedPageBreak/>
         <w:t>INDIRECT</w:t>
       </w:r>
       <w:r>
@@ -3437,8 +3874,8 @@
       <w:r>
         <w:rPr>
           <w:b/>
-          <w:sz w:val="28"/>
-          <w:szCs w:val="28"/>
+          <w:sz w:val="32"/>
+          <w:szCs w:val="32"/>
           <w:lang w:val="en-GB"/>
         </w:rPr>
         <w:t xml:space="preserve">Visualization </w:t>
@@ -3447,8 +3884,8 @@
       <w:r>
         <w:rPr>
           <w:b/>
-          <w:sz w:val="28"/>
-          <w:szCs w:val="28"/>
+          <w:sz w:val="32"/>
+          <w:szCs w:val="32"/>
           <w:lang w:val="en-GB"/>
         </w:rPr>
         <w:t>Expertise</w:t>
@@ -3752,16 +4189,15 @@
           <w:lang w:val="en-GB"/>
         </w:rPr>
       </w:pPr>
-    </w:p>
-    <w:p>
-      <w:pPr>
-        <w:rPr>
-          <w:b/>
-          <w:sz w:val="28"/>
-          <w:szCs w:val="28"/>
-          <w:lang w:val="en-GB"/>
-        </w:rPr>
-      </w:pPr>
+      <w:r>
+        <w:rPr>
+          <w:b/>
+          <w:sz w:val="28"/>
+          <w:szCs w:val="28"/>
+          <w:lang w:val="en-GB"/>
+        </w:rPr>
+        <w:t xml:space="preserve">Charts </w:t>
+      </w:r>
     </w:p>
     <w:p>
       <w:pPr>
@@ -3799,8 +4235,8 @@
       <w:r>
         <w:rPr>
           <w:b/>
-          <w:sz w:val="28"/>
-          <w:szCs w:val="28"/>
+          <w:sz w:val="32"/>
+          <w:szCs w:val="32"/>
           <w:lang w:val="en-GB"/>
         </w:rPr>
         <w:t xml:space="preserve">Efficiency </w:t>
@@ -3809,8 +4245,8 @@
       <w:r>
         <w:rPr>
           <w:b/>
-          <w:sz w:val="28"/>
-          <w:szCs w:val="28"/>
+          <w:sz w:val="32"/>
+          <w:szCs w:val="32"/>
           <w:lang w:val="en-GB"/>
         </w:rPr>
         <w:t>Enhancers</w:t>
@@ -3964,25 +4400,7 @@
           <w:szCs w:val="28"/>
           <w:lang w:val="en-GB"/>
         </w:rPr>
-        <w:t xml:space="preserve">To autofit </w:t>
-      </w:r>
-      <w:r>
-        <w:rPr>
-          <w:b/>
-          <w:sz w:val="28"/>
-          <w:szCs w:val="28"/>
-          <w:lang w:val="en-GB"/>
-        </w:rPr>
-        <w:t>row</w:t>
-      </w:r>
-      <w:r>
-        <w:rPr>
-          <w:b/>
-          <w:sz w:val="28"/>
-          <w:szCs w:val="28"/>
-          <w:lang w:val="en-GB"/>
-        </w:rPr>
-        <w:t xml:space="preserve"> </w:t>
+        <w:t xml:space="preserve">To autofit row </w:t>
       </w:r>
       <w:proofErr w:type="gramStart"/>
       <w:r>
@@ -4012,16 +4430,7 @@
           <w:szCs w:val="28"/>
           <w:lang w:val="en-GB"/>
         </w:rPr>
-        <w:t>altHO</w:t>
-      </w:r>
-      <w:r>
-        <w:rPr>
-          <w:b/>
-          <w:sz w:val="28"/>
-          <w:szCs w:val="28"/>
-          <w:lang w:val="en-GB"/>
-        </w:rPr>
-        <w:t>A</w:t>
+        <w:t>altHOA</w:t>
       </w:r>
       <w:proofErr w:type="spellEnd"/>
     </w:p>
@@ -4102,18 +4511,22 @@
     </w:p>
     <w:p>
       <w:pPr>
-        <w:pStyle w:val="ListParagraph"/>
-        <w:numPr>
-          <w:ilvl w:val="0"/>
-          <w:numId w:val="7"/>
-        </w:numPr>
-        <w:rPr>
-          <w:b/>
-          <w:sz w:val="28"/>
-          <w:szCs w:val="28"/>
-          <w:lang w:val="en-GB"/>
-        </w:rPr>
-      </w:pPr>
+        <w:rPr>
+          <w:b/>
+          <w:sz w:val="28"/>
+          <w:szCs w:val="28"/>
+          <w:lang w:val="en-GB"/>
+        </w:rPr>
+      </w:pPr>
+      <w:r>
+        <w:rPr>
+          <w:b/>
+          <w:sz w:val="28"/>
+          <w:szCs w:val="28"/>
+          <w:lang w:val="en-GB"/>
+        </w:rPr>
+        <w:t>---------------------------------------------------------------------------------------------------------</w:t>
+      </w:r>
     </w:p>
     <w:sectPr>
       <w:pgSz w:w="11906" w:h="16838"/>
@@ -4128,6 +4541,185 @@
 <file path=word/numbering.xml><?xml version="1.0" encoding="utf-8"?>
 <w:numbering xmlns:wpc="http://schemas.microsoft.com/office/word/2010/wordprocessingCanvas" xmlns:cx="http://schemas.microsoft.com/office/drawing/2014/chartex" xmlns:cx1="http://schemas.microsoft.com/office/drawing/2015/9/8/chartex" xmlns:cx2="http://schemas.microsoft.com/office/drawing/2015/10/21/chartex" xmlns:cx3="http://schemas.microsoft.com/office/drawing/2016/5/9/chartex" xmlns:cx4="http://schemas.microsoft.com/office/drawing/2016/5/10/chartex" xmlns:cx5="http://schemas.microsoft.com/office/drawing/2016/5/11/chartex" xmlns:cx6="http://schemas.microsoft.com/office/drawing/2016/5/12/chartex" xmlns:cx7="http://schemas.microsoft.com/office/drawing/2016/5/13/chartex" xmlns:cx8="http://schemas.microsoft.com/office/drawing/2016/5/14/chartex" xmlns:mc="http://schemas.openxmlformats.org/markup-compatibility/2006" xmlns:aink="http://schemas.microsoft.com/office/drawing/2016/ink" xmlns:am3d="http://schemas.microsoft.com/office/drawing/2017/model3d" xmlns:o="urn:schemas-microsoft-com:office:office" xmlns:r="http://schemas.openxmlformats.org/officeDocument/2006/relationships" xmlns:m="http://schemas.openxmlformats.org/officeDocument/2006/math" xmlns:v="urn:schemas-microsoft-com:vml" xmlns:wp14="http://schemas.microsoft.com/office/word/2010/wordprocessingDrawing" xmlns:wp="http://schemas.openxmlformats.org/drawingml/2006/wordprocessingDrawing" xmlns:w10="urn:schemas-microsoft-com:office:word" xmlns:w="http://schemas.openxmlformats.org/wordprocessingml/2006/main" xmlns:w14="http://schemas.microsoft.com/office/word/2010/wordml" xmlns:w15="http://schemas.microsoft.com/office/word/2012/wordml" xmlns:w16cid="http://schemas.microsoft.com/office/word/2016/wordml/cid" xmlns:w16se="http://schemas.microsoft.com/office/word/2015/wordml/symex" xmlns:wpg="http://schemas.microsoft.com/office/word/2010/wordprocessingGroup" xmlns:wpi="http://schemas.microsoft.com/office/word/2010/wordprocessingInk" xmlns:wne="http://schemas.microsoft.com/office/word/2006/wordml" xmlns:wps="http://schemas.microsoft.com/office/word/2010/wordprocessingShape" mc:Ignorable="w14 w15 w16se w16cid wp14">
   <w:abstractNum w:abstractNumId="0" w15:restartNumberingAfterBreak="0">
+    <w:nsid w:val="054C56BA"/>
+    <w:multiLevelType w:val="hybridMultilevel"/>
+    <w:tmpl w:val="975E56C8"/>
+    <w:lvl w:ilvl="0" w:tplc="F348CF76">
+      <w:start w:val="1"/>
+      <w:numFmt w:val="decimal"/>
+      <w:lvlText w:val="%1."/>
+      <w:lvlJc w:val="left"/>
+      <w:pPr>
+        <w:ind w:left="720" w:hanging="360"/>
+      </w:pPr>
+      <w:rPr>
+        <w:rFonts w:hint="default"/>
+        <w:b/>
+      </w:rPr>
+    </w:lvl>
+    <w:lvl w:ilvl="1" w:tplc="40090019" w:tentative="1">
+      <w:start w:val="1"/>
+      <w:numFmt w:val="lowerLetter"/>
+      <w:lvlText w:val="%2."/>
+      <w:lvlJc w:val="left"/>
+      <w:pPr>
+        <w:ind w:left="1440" w:hanging="360"/>
+      </w:pPr>
+    </w:lvl>
+    <w:lvl w:ilvl="2" w:tplc="4009001B" w:tentative="1">
+      <w:start w:val="1"/>
+      <w:numFmt w:val="lowerRoman"/>
+      <w:lvlText w:val="%3."/>
+      <w:lvlJc w:val="right"/>
+      <w:pPr>
+        <w:ind w:left="2160" w:hanging="180"/>
+      </w:pPr>
+    </w:lvl>
+    <w:lvl w:ilvl="3" w:tplc="4009000F" w:tentative="1">
+      <w:start w:val="1"/>
+      <w:numFmt w:val="decimal"/>
+      <w:lvlText w:val="%4."/>
+      <w:lvlJc w:val="left"/>
+      <w:pPr>
+        <w:ind w:left="2880" w:hanging="360"/>
+      </w:pPr>
+    </w:lvl>
+    <w:lvl w:ilvl="4" w:tplc="40090019" w:tentative="1">
+      <w:start w:val="1"/>
+      <w:numFmt w:val="lowerLetter"/>
+      <w:lvlText w:val="%5."/>
+      <w:lvlJc w:val="left"/>
+      <w:pPr>
+        <w:ind w:left="3600" w:hanging="360"/>
+      </w:pPr>
+    </w:lvl>
+    <w:lvl w:ilvl="5" w:tplc="4009001B" w:tentative="1">
+      <w:start w:val="1"/>
+      <w:numFmt w:val="lowerRoman"/>
+      <w:lvlText w:val="%6."/>
+      <w:lvlJc w:val="right"/>
+      <w:pPr>
+        <w:ind w:left="4320" w:hanging="180"/>
+      </w:pPr>
+    </w:lvl>
+    <w:lvl w:ilvl="6" w:tplc="4009000F" w:tentative="1">
+      <w:start w:val="1"/>
+      <w:numFmt w:val="decimal"/>
+      <w:lvlText w:val="%7."/>
+      <w:lvlJc w:val="left"/>
+      <w:pPr>
+        <w:ind w:left="5040" w:hanging="360"/>
+      </w:pPr>
+    </w:lvl>
+    <w:lvl w:ilvl="7" w:tplc="40090019" w:tentative="1">
+      <w:start w:val="1"/>
+      <w:numFmt w:val="lowerLetter"/>
+      <w:lvlText w:val="%8."/>
+      <w:lvlJc w:val="left"/>
+      <w:pPr>
+        <w:ind w:left="5760" w:hanging="360"/>
+      </w:pPr>
+    </w:lvl>
+    <w:lvl w:ilvl="8" w:tplc="4009001B" w:tentative="1">
+      <w:start w:val="1"/>
+      <w:numFmt w:val="lowerRoman"/>
+      <w:lvlText w:val="%9."/>
+      <w:lvlJc w:val="right"/>
+      <w:pPr>
+        <w:ind w:left="6480" w:hanging="180"/>
+      </w:pPr>
+    </w:lvl>
+  </w:abstractNum>
+  <w:abstractNum w:abstractNumId="1" w15:restartNumberingAfterBreak="0">
+    <w:nsid w:val="116A3B8E"/>
+    <w:multiLevelType w:val="hybridMultilevel"/>
+    <w:tmpl w:val="E578B72C"/>
+    <w:lvl w:ilvl="0" w:tplc="6BF40248">
+      <w:start w:val="1"/>
+      <w:numFmt w:val="upperLetter"/>
+      <w:lvlText w:val="%1."/>
+      <w:lvlJc w:val="left"/>
+      <w:pPr>
+        <w:ind w:left="1080" w:hanging="360"/>
+      </w:pPr>
+      <w:rPr>
+        <w:rFonts w:hint="default"/>
+      </w:rPr>
+    </w:lvl>
+    <w:lvl w:ilvl="1" w:tplc="40090019" w:tentative="1">
+      <w:start w:val="1"/>
+      <w:numFmt w:val="lowerLetter"/>
+      <w:lvlText w:val="%2."/>
+      <w:lvlJc w:val="left"/>
+      <w:pPr>
+        <w:ind w:left="1800" w:hanging="360"/>
+      </w:pPr>
+    </w:lvl>
+    <w:lvl w:ilvl="2" w:tplc="4009001B" w:tentative="1">
+      <w:start w:val="1"/>
+      <w:numFmt w:val="lowerRoman"/>
+      <w:lvlText w:val="%3."/>
+      <w:lvlJc w:val="right"/>
+      <w:pPr>
+        <w:ind w:left="2520" w:hanging="180"/>
+      </w:pPr>
+    </w:lvl>
+    <w:lvl w:ilvl="3" w:tplc="4009000F" w:tentative="1">
+      <w:start w:val="1"/>
+      <w:numFmt w:val="decimal"/>
+      <w:lvlText w:val="%4."/>
+      <w:lvlJc w:val="left"/>
+      <w:pPr>
+        <w:ind w:left="3240" w:hanging="360"/>
+      </w:pPr>
+    </w:lvl>
+    <w:lvl w:ilvl="4" w:tplc="40090019" w:tentative="1">
+      <w:start w:val="1"/>
+      <w:numFmt w:val="lowerLetter"/>
+      <w:lvlText w:val="%5."/>
+      <w:lvlJc w:val="left"/>
+      <w:pPr>
+        <w:ind w:left="3960" w:hanging="360"/>
+      </w:pPr>
+    </w:lvl>
+    <w:lvl w:ilvl="5" w:tplc="4009001B" w:tentative="1">
+      <w:start w:val="1"/>
+      <w:numFmt w:val="lowerRoman"/>
+      <w:lvlText w:val="%6."/>
+      <w:lvlJc w:val="right"/>
+      <w:pPr>
+        <w:ind w:left="4680" w:hanging="180"/>
+      </w:pPr>
+    </w:lvl>
+    <w:lvl w:ilvl="6" w:tplc="4009000F" w:tentative="1">
+      <w:start w:val="1"/>
+      <w:numFmt w:val="decimal"/>
+      <w:lvlText w:val="%7."/>
+      <w:lvlJc w:val="left"/>
+      <w:pPr>
+        <w:ind w:left="5400" w:hanging="360"/>
+      </w:pPr>
+    </w:lvl>
+    <w:lvl w:ilvl="7" w:tplc="40090019" w:tentative="1">
+      <w:start w:val="1"/>
+      <w:numFmt w:val="lowerLetter"/>
+      <w:lvlText w:val="%8."/>
+      <w:lvlJc w:val="left"/>
+      <w:pPr>
+        <w:ind w:left="6120" w:hanging="360"/>
+      </w:pPr>
+    </w:lvl>
+    <w:lvl w:ilvl="8" w:tplc="4009001B" w:tentative="1">
+      <w:start w:val="1"/>
+      <w:numFmt w:val="lowerRoman"/>
+      <w:lvlText w:val="%9."/>
+      <w:lvlJc w:val="right"/>
+      <w:pPr>
+        <w:ind w:left="6840" w:hanging="180"/>
+      </w:pPr>
+    </w:lvl>
+  </w:abstractNum>
+  <w:abstractNum w:abstractNumId="2" w15:restartNumberingAfterBreak="0">
     <w:nsid w:val="18D713B2"/>
     <w:multiLevelType w:val="hybridMultilevel"/>
     <w:tmpl w:val="9316275C"/>
@@ -4216,7 +4808,7 @@
       </w:pPr>
     </w:lvl>
   </w:abstractNum>
-  <w:abstractNum w:abstractNumId="1" w15:restartNumberingAfterBreak="0">
+  <w:abstractNum w:abstractNumId="3" w15:restartNumberingAfterBreak="0">
     <w:nsid w:val="23BD3637"/>
     <w:multiLevelType w:val="hybridMultilevel"/>
     <w:tmpl w:val="7812EDB6"/>
@@ -4306,7 +4898,7 @@
       </w:pPr>
     </w:lvl>
   </w:abstractNum>
-  <w:abstractNum w:abstractNumId="2" w15:restartNumberingAfterBreak="0">
+  <w:abstractNum w:abstractNumId="4" w15:restartNumberingAfterBreak="0">
     <w:nsid w:val="2AAF3DA8"/>
     <w:multiLevelType w:val="hybridMultilevel"/>
     <w:tmpl w:val="8B666928"/>
@@ -4395,7 +4987,7 @@
       </w:pPr>
     </w:lvl>
   </w:abstractNum>
-  <w:abstractNum w:abstractNumId="3" w15:restartNumberingAfterBreak="0">
+  <w:abstractNum w:abstractNumId="5" w15:restartNumberingAfterBreak="0">
     <w:nsid w:val="322E5690"/>
     <w:multiLevelType w:val="hybridMultilevel"/>
     <w:tmpl w:val="6486CA52"/>
@@ -4487,7 +5079,7 @@
       </w:pPr>
     </w:lvl>
   </w:abstractNum>
-  <w:abstractNum w:abstractNumId="4" w15:restartNumberingAfterBreak="0">
+  <w:abstractNum w:abstractNumId="6" w15:restartNumberingAfterBreak="0">
     <w:nsid w:val="6FA42474"/>
     <w:multiLevelType w:val="hybridMultilevel"/>
     <w:tmpl w:val="AE22DEB2"/>
@@ -4576,7 +5168,7 @@
       </w:pPr>
     </w:lvl>
   </w:abstractNum>
-  <w:abstractNum w:abstractNumId="5" w15:restartNumberingAfterBreak="0">
+  <w:abstractNum w:abstractNumId="7" w15:restartNumberingAfterBreak="0">
     <w:nsid w:val="74B9408A"/>
     <w:multiLevelType w:val="hybridMultilevel"/>
     <w:tmpl w:val="D64CA146"/>
@@ -4667,7 +5259,7 @@
       </w:pPr>
     </w:lvl>
   </w:abstractNum>
-  <w:abstractNum w:abstractNumId="6" w15:restartNumberingAfterBreak="0">
+  <w:abstractNum w:abstractNumId="8" w15:restartNumberingAfterBreak="0">
     <w:nsid w:val="7CD965D9"/>
     <w:multiLevelType w:val="hybridMultilevel"/>
     <w:tmpl w:val="E74E1B24"/>
@@ -4757,25 +5349,31 @@
     </w:lvl>
   </w:abstractNum>
   <w:num w:numId="1">
-    <w:abstractNumId w:val="0"/>
+    <w:abstractNumId w:val="2"/>
   </w:num>
   <w:num w:numId="2">
+    <w:abstractNumId w:val="7"/>
+  </w:num>
+  <w:num w:numId="3">
     <w:abstractNumId w:val="5"/>
   </w:num>
-  <w:num w:numId="3">
+  <w:num w:numId="4">
+    <w:abstractNumId w:val="4"/>
+  </w:num>
+  <w:num w:numId="5">
+    <w:abstractNumId w:val="6"/>
+  </w:num>
+  <w:num w:numId="6">
     <w:abstractNumId w:val="3"/>
   </w:num>
-  <w:num w:numId="4">
-    <w:abstractNumId w:val="2"/>
+  <w:num w:numId="7">
+    <w:abstractNumId w:val="8"/>
   </w:num>
-  <w:num w:numId="5">
-    <w:abstractNumId w:val="4"/>
-  </w:num>
-  <w:num w:numId="6">
+  <w:num w:numId="8">
     <w:abstractNumId w:val="1"/>
   </w:num>
-  <w:num w:numId="7">
-    <w:abstractNumId w:val="6"/>
+  <w:num w:numId="9">
+    <w:abstractNumId w:val="0"/>
   </w:num>
 </w:numbering>
 </file>

</xml_diff>